<commit_message>
Deploying to gh-pages from @ volodya-lombrozo/newsman@85f7c7cf413df3161711194d407fccaba889abeb 🚀
</commit_message>
<xml_diff>
--- a/2026/09/21/21.09.2026.volodya-lombrozo.gpt-5-6.docx
+++ b/2026/09/21/21.09.2026.volodya-lombrozo.gpt-5-6.docx
@@ -143,71 +143,71 @@
           <w:sz w:val="24"/>
           <w:szCs w:val="24"/>
         </w:rPr>
-        <w:t xml:space="preserve">No risks identified [#1489].</w:t>
-      </w:r>
-    </w:p>
-    <w:p>
-      <w:pPr>
-        <w:numPr>
-          <w:ilvl w:val="0"/>
-          <w:numId w:val="1"/>
-        </w:numPr>
-      </w:pPr>
-      <w:r>
-        <w:rPr>
-          <w:rFonts w:ascii="Times New Roman" w:hAnsi="Times New Roman" w:cs="Times New Roman"/>
-          <w:sz w:val="24"/>
-          <w:szCs w:val="24"/>
-        </w:rPr>
-        <w:t xml:space="preserve">No risks identified [#1487].</w:t>
-      </w:r>
-    </w:p>
-    <w:p>
-      <w:pPr>
-        <w:numPr>
-          <w:ilvl w:val="0"/>
-          <w:numId w:val="1"/>
-        </w:numPr>
-      </w:pPr>
-      <w:r>
-        <w:rPr>
-          <w:rFonts w:ascii="Times New Roman" w:hAnsi="Times New Roman" w:cs="Times New Roman"/>
-          <w:sz w:val="24"/>
-          <w:szCs w:val="24"/>
-        </w:rPr>
-        <w:t xml:space="preserve">No risks identified [#1482].</w:t>
-      </w:r>
-    </w:p>
-    <w:p>
-      <w:pPr>
-        <w:numPr>
-          <w:ilvl w:val="0"/>
-          <w:numId w:val="1"/>
-        </w:numPr>
-      </w:pPr>
-      <w:r>
-        <w:rPr>
-          <w:rFonts w:ascii="Times New Roman" w:hAnsi="Times New Roman" w:cs="Times New Roman"/>
-          <w:sz w:val="24"/>
-          <w:szCs w:val="24"/>
-        </w:rPr>
-        <w:t xml:space="preserve">No risks identified [#1477].</w:t>
-      </w:r>
-    </w:p>
-    <w:p>
-      <w:pPr>
-        <w:numPr>
-          <w:ilvl w:val="0"/>
-          <w:numId w:val="1"/>
-        </w:numPr>
-      </w:pPr>
-      <w:r>
-        <w:rPr>
-          <w:rFonts w:ascii="Times New Roman" w:hAnsi="Times New Roman" w:cs="Times New Roman"/>
-          <w:sz w:val="24"/>
-          <w:szCs w:val="24"/>
-        </w:rPr>
-        <w:t xml:space="preserve">No risks identified [#1464].</w:t>
+        <w:t xml:space="preserve">PR 1489: No risks identified [#1475].</w:t>
+      </w:r>
+    </w:p>
+    <w:p>
+      <w:pPr>
+        <w:numPr>
+          <w:ilvl w:val="0"/>
+          <w:numId w:val="1"/>
+        </w:numPr>
+      </w:pPr>
+      <w:r>
+        <w:rPr>
+          <w:rFonts w:ascii="Times New Roman" w:hAnsi="Times New Roman" w:cs="Times New Roman"/>
+          <w:sz w:val="24"/>
+          <w:szCs w:val="24"/>
+        </w:rPr>
+        <w:t xml:space="preserve">PR 1487: No risks identified [#1475].</w:t>
+      </w:r>
+    </w:p>
+    <w:p>
+      <w:pPr>
+        <w:numPr>
+          <w:ilvl w:val="0"/>
+          <w:numId w:val="1"/>
+        </w:numPr>
+      </w:pPr>
+      <w:r>
+        <w:rPr>
+          <w:rFonts w:ascii="Times New Roman" w:hAnsi="Times New Roman" w:cs="Times New Roman"/>
+          <w:sz w:val="24"/>
+          <w:szCs w:val="24"/>
+        </w:rPr>
+        <w:t xml:space="preserve">PR 1482: No risks identified [#1475].</w:t>
+      </w:r>
+    </w:p>
+    <w:p>
+      <w:pPr>
+        <w:numPr>
+          <w:ilvl w:val="0"/>
+          <w:numId w:val="1"/>
+        </w:numPr>
+      </w:pPr>
+      <w:r>
+        <w:rPr>
+          <w:rFonts w:ascii="Times New Roman" w:hAnsi="Times New Roman" w:cs="Times New Roman"/>
+          <w:sz w:val="24"/>
+          <w:szCs w:val="24"/>
+        </w:rPr>
+        <w:t xml:space="preserve">PR 1477: No risks identified [#1475].</w:t>
+      </w:r>
+    </w:p>
+    <w:p>
+      <w:pPr>
+        <w:numPr>
+          <w:ilvl w:val="0"/>
+          <w:numId w:val="1"/>
+        </w:numPr>
+      </w:pPr>
+      <w:r>
+        <w:rPr>
+          <w:rFonts w:ascii="Times New Roman" w:hAnsi="Times New Roman" w:cs="Times New Roman"/>
+          <w:sz w:val="24"/>
+          <w:szCs w:val="24"/>
+        </w:rPr>
+        <w:t xml:space="preserve">PR 1464: Hand-written XMIR may proliferate accidentally, making test cases less appropriate and readable [#1463].</w:t>
       </w:r>
     </w:p>
     <w:p>

</xml_diff>